<commit_message>
Processing Screen Field Mapping v1.3: scope + cleanup fixes
% bar IN SCOPE: ZONE 3 heading now explicitly marked "IN SCOPE for S1"
and footer updated to "% bar (in scope)". Decision confirmed May 23.

Stale HTML reference removed: paragraph flagging "two stale entries in
technical_data_schema.html" removed — those entries were fixed in the
HTML (May 23 commit). Replaced with a cleaner source-of-truth note:
changes to % values or copy must update technical_data_schema.html first.

Message count fixed: "cycling through 3 states" → "4 strings" to
correctly reflect the 4 user-facing message strings (upload_received,
mediapipe_started, haiku_started, analysis_ready).

Version bump v1.2 → v1.3, date updated May 23, 2026.

Co-Authored-By: Claude Sonnet 4.6 <noreply@anthropic.com>
</commit_message>
<xml_diff>
--- a/Kinetic_Processing_Screen_Field_Mapping.docx
+++ b/Kinetic_Processing_Screen_Field_Mapping.docx
@@ -24,7 +24,7 @@
           <w:color w:val="6E6788"/>
           <w:sz w:val="20"/>
         </w:rPr>
-        <w:t>Source: technical_data_schema.html + FE_SSE_and_Errors.md  ·  SSE stream: GET /analysis/{id}/stream  ·  v1.2</w:t>
+        <w:t>Source: technical_data_schema.html + FE_SSE_and_Errors.md  ·  SSE stream: GET /analysis/{id}/stream  ·  v1.3  ·  May 23, 2026</w:t>
       </w:r>
     </w:p>
     <w:p>
@@ -1285,7 +1285,7 @@
           <w:color w:val="4A3B00"/>
           <w:sz w:val="20"/>
         </w:rPr>
-        <w:t>• The two stale entries in technical_data_schema.html ('Almost there...' at 96% and 'Your analysis is ready.' on analysis_complete) reference retired events. Ignore them.</w:t>
+        <w:t>• technical_data_schema.html is the source of truth for SSE events and % values. Any change to % values or message copy must be updated there first, then reflected here.</w:t>
       </w:r>
     </w:p>
     <w:p/>
@@ -1732,7 +1732,7 @@
           <w:color w:val="6A4DFF"/>
           <w:sz w:val="17"/>
         </w:rPr>
-        <w:t xml:space="preserve">  ZONE 3 — % PROGRESS BAR  ← SSE-driven  </w:t>
+        <w:t xml:space="preserve">  ZONE 3 — % PROGRESS BAR  ← SSE-driven  ·  IN SCOPE for S1  </w:t>
       </w:r>
     </w:p>
     <w:p>
@@ -2561,7 +2561,7 @@
           <w:color w:val="0A7EA4"/>
           <w:sz w:val="18"/>
         </w:rPr>
-        <w:t xml:space="preserve">  ▶  Loading state — message cycling through 3 states as SSE events arrive</w:t>
+        <w:t xml:space="preserve">  ▶  Loading state — message cycling through 4 strings as SSE events arrive</w:t>
       </w:r>
     </w:p>
     <w:p>
@@ -5937,7 +5937,7 @@
           <w:color w:val="6E6788"/>
           <w:sz w:val="17"/>
         </w:rPr>
-        <w:t>Source: technical_data_schema.html + FE_SSE_and_Errors.md  ·  v1.2  ·  May 2026  ·  % bar + SSE text message  ·  design checklist copy is placeholder — use messages in this doc</w:t>
+        <w:t>Source: technical_data_schema.html + FE_SSE_and_Errors.md  ·  v1.3  ·  May 23, 2026  ·  % bar (in scope) + SSE text message  ·  design checklist copy is placeholder only</w:t>
       </w:r>
     </w:p>
     <w:sectPr>

</xml_diff>